<commit_message>
V1.2 - Quita sección coevaluación del informe y repo
</commit_message>
<xml_diff>
--- a/informe/Informe_EP3_Aduana.docx
+++ b/informe/Informe_EP3_Aduana.docx
@@ -5900,38 +5900,7 @@
           <w:sz w:val="28"/>
           <w:szCs w:val="28"/>
         </w:rPr>
-        <w:t xml:space="preserve">6. Coevaluación Intergrupal</w:t>
-      </w:r>
-    </w:p>
-    <w:p>
-      <w:pPr>
-        <w:spacing w:after="80" w:before="80"/>
-      </w:pPr>
-      <w:r>
-        <w:rPr>
-          <w:rFonts w:ascii="Arial" w:cs="Arial" w:eastAsia="Arial" w:hAnsi="Arial"/>
-          <w:b/>
-          <w:bCs/>
-          <w:sz w:val="22"/>
-          <w:szCs w:val="22"/>
-        </w:rPr>
-        <w:t xml:space="preserve">Equipo evaluado: </w:t>
-      </w:r>
-      <w:r>
-        <w:rPr>
-          <w:rFonts w:ascii="Arial" w:cs="Arial" w:eastAsia="Arial" w:hAnsi="Arial"/>
-          <w:sz w:val="22"/>
-          <w:szCs w:val="22"/>
-        </w:rPr>
-        <w:t xml:space="preserve">[Nombre del equipo evaluado]</w:t>
-      </w:r>
-    </w:p>
-    <w:p>
-      <w:pPr>
-        <w:spacing w:after="60" w:before="60"/>
-      </w:pPr>
-      <w:r>
-        <w:t xml:space="preserve"/>
+        <w:t xml:space="preserve">6. Conclusiones del Equipo</w:t>
       </w:r>
     </w:p>
     <w:p>
@@ -5948,13 +5917,12 @@
           <w:sz w:val="24"/>
           <w:szCs w:val="24"/>
         </w:rPr>
-        <w:t xml:space="preserve">Fortalezas observadas:</w:t>
-      </w:r>
-    </w:p>
-    <w:p>
-      <w:pPr>
-        <w:spacing w:after="60" w:before="60"/>
-        <w:ind w:left="720" w:hanging="360"/>
+        <w:t xml:space="preserve">Reflexión sobre el aprendizaje logrado:</w:t>
+      </w:r>
+    </w:p>
+    <w:p>
+      <w:pPr>
+        <w:spacing w:after="80" w:before="80"/>
       </w:pPr>
       <w:r>
         <w:rPr>
@@ -5962,21 +5930,7 @@
           <w:sz w:val="22"/>
           <w:szCs w:val="22"/>
         </w:rPr>
-        <w:t xml:space="preserve">• [Ejemplo: El prototipo presentado tiene una navegación clara y cubre los módulos principales del caso]</w:t>
-      </w:r>
-    </w:p>
-    <w:p>
-      <w:pPr>
-        <w:spacing w:after="60" w:before="60"/>
-        <w:ind w:left="720" w:hanging="360"/>
-      </w:pPr>
-      <w:r>
-        <w:rPr>
-          <w:rFonts w:ascii="Arial" w:cs="Arial" w:eastAsia="Arial" w:hAnsi="Arial"/>
-          <w:sz w:val="22"/>
-          <w:szCs w:val="22"/>
-        </w:rPr>
-        <w:t xml:space="preserve">• [Ejemplo: La planilla de casos de prueba está bien estructurada con evidencias claras]</w:t>
+        <w:t xml:space="preserve">Durante el desarrollo de esta evaluación, el equipo logró integrar conocimientos de prototipado ágil, modelos de calidad ISO9126/ISO25000 y control de versiones en un contexto real de modernización del sistema de Aduana chilena. La herramienta Figma permitió materializar los requisitos del caso en pantallas navegables, facilitando la validación de funcionalidades antes de una implementación real.</w:t>
       </w:r>
     </w:p>
     <w:p>
@@ -6001,7 +5955,7 @@
           <w:sz w:val="24"/>
           <w:szCs w:val="24"/>
         </w:rPr>
-        <w:t xml:space="preserve">Oportunidades de mejora:</w:t>
+        <w:t xml:space="preserve">Principales desafíos enfrentados:</w:t>
       </w:r>
     </w:p>
     <w:p>
@@ -6015,7 +5969,7 @@
           <w:sz w:val="22"/>
           <w:szCs w:val="22"/>
         </w:rPr>
-        <w:t xml:space="preserve">• [Ejemplo: Se sugiere agregar validaciones en el módulo de vehículos para campos obligatorios]</w:t>
+        <w:t xml:space="preserve">• Cubrir todos los requisitos funcionales del caso (menores, vehículos, SAG, PDI, informes) en un prototipo coherente y navegable.</w:t>
       </w:r>
     </w:p>
     <w:p>
@@ -6029,12 +5983,26 @@
           <w:sz w:val="22"/>
           <w:szCs w:val="22"/>
         </w:rPr>
-        <w:t xml:space="preserve">• [Ejemplo: El control de versiones podría detallar mejor el motivo de cada cambio]</w:t>
+        <w:t xml:space="preserve">• Seleccionar y aplicar correctamente las características de calidad ISO9126 más relevantes para un sistema de frontera de alta concurrencia.</w:t>
       </w:r>
     </w:p>
     <w:p>
       <w:pPr>
         <w:spacing w:after="60" w:before="60"/>
+        <w:ind w:left="720" w:hanging="360"/>
+      </w:pPr>
+      <w:r>
+        <w:rPr>
+          <w:rFonts w:ascii="Arial" w:cs="Arial" w:eastAsia="Arial" w:hAnsi="Arial"/>
+          <w:sz w:val="22"/>
+          <w:szCs w:val="22"/>
+        </w:rPr>
+        <w:t xml:space="preserve">• Documentar el control de versiones de forma trazable, vinculando cada cambio al requisito que lo motivó.</w:t>
+      </w:r>
+    </w:p>
+    <w:p>
+      <w:pPr>
+        <w:spacing w:after="60" w:before="60"/>
       </w:pPr>
       <w:r>
         <w:t xml:space="preserve"/>
@@ -6042,22 +6010,39 @@
     </w:p>
     <w:p>
       <w:pPr>
-        <w:spacing w:after="80" w:before="80"/>
+        <w:pStyle w:val="Heading2"/>
+        <w:spacing w:after="120" w:before="240"/>
       </w:pPr>
       <w:r>
         <w:rPr>
           <w:rFonts w:ascii="Arial" w:cs="Arial" w:eastAsia="Arial" w:hAnsi="Arial"/>
           <w:b/>
           <w:bCs/>
+          <w:color w:val="1F5C99"/>
+          <w:sz w:val="24"/>
+          <w:szCs w:val="24"/>
+        </w:rPr>
+        <w:t xml:space="preserve">Propuestas de mejora para futuras iteraciones:</w:t>
+      </w:r>
+    </w:p>
+    <w:p>
+      <w:pPr>
+        <w:spacing w:after="60" w:before="60"/>
+        <w:ind w:left="720" w:hanging="360"/>
+      </w:pPr>
+      <w:r>
+        <w:rPr>
+          <w:rFonts w:ascii="Arial" w:cs="Arial" w:eastAsia="Arial" w:hAnsi="Arial"/>
           <w:sz w:val="22"/>
           <w:szCs w:val="22"/>
         </w:rPr>
-        <w:t xml:space="preserve">Comentarios constructivos:</w:t>
-      </w:r>
-    </w:p>
-    <w:p>
-      <w:pPr>
-        <w:spacing w:after="80" w:before="80"/>
+        <w:t xml:space="preserve">• Incorporar pruebas de usabilidad con funcionarios reales del servicio de Aduana para validar la interfaz.</w:t>
+      </w:r>
+    </w:p>
+    <w:p>
+      <w:pPr>
+        <w:spacing w:after="60" w:before="60"/>
+        <w:ind w:left="720" w:hanging="360"/>
       </w:pPr>
       <w:r>
         <w:rPr>
@@ -6065,7 +6050,21 @@
           <w:sz w:val="22"/>
           <w:szCs w:val="22"/>
         </w:rPr>
-        <w:t xml:space="preserve">[Texto breve con retroalimentación respetuosa y técnica dirigida al equipo evaluado]</w:t>
+        <w:t xml:space="preserve">• Ampliar la integración con el sistema de migraciones argentino (Horcones) para simular el intercambio de datos limítrofe.</w:t>
+      </w:r>
+    </w:p>
+    <w:p>
+      <w:pPr>
+        <w:spacing w:after="60" w:before="60"/>
+        <w:ind w:left="720" w:hanging="360"/>
+      </w:pPr>
+      <w:r>
+        <w:rPr>
+          <w:rFonts w:ascii="Arial" w:cs="Arial" w:eastAsia="Arial" w:hAnsi="Arial"/>
+          <w:sz w:val="22"/>
+          <w:szCs w:val="22"/>
+        </w:rPr>
+        <w:t xml:space="preserve">• Agregar módulo de notificaciones en tiempo real sobre el estado del trámite para turistas y conductores en espera.</w:t>
       </w:r>
     </w:p>
     <w:p>
@@ -6090,196 +6089,7 @@
           <w:sz w:val="28"/>
           <w:szCs w:val="28"/>
         </w:rPr>
-        <w:t xml:space="preserve">7. Conclusiones del Equipo</w:t>
-      </w:r>
-    </w:p>
-    <w:p>
-      <w:pPr>
-        <w:pStyle w:val="Heading2"/>
-        <w:spacing w:after="120" w:before="240"/>
-      </w:pPr>
-      <w:r>
-        <w:rPr>
-          <w:rFonts w:ascii="Arial" w:cs="Arial" w:eastAsia="Arial" w:hAnsi="Arial"/>
-          <w:b/>
-          <w:bCs/>
-          <w:color w:val="1F5C99"/>
-          <w:sz w:val="24"/>
-          <w:szCs w:val="24"/>
-        </w:rPr>
-        <w:t xml:space="preserve">Reflexión sobre el aprendizaje logrado:</w:t>
-      </w:r>
-    </w:p>
-    <w:p>
-      <w:pPr>
-        <w:spacing w:after="80" w:before="80"/>
-      </w:pPr>
-      <w:r>
-        <w:rPr>
-          <w:rFonts w:ascii="Arial" w:cs="Arial" w:eastAsia="Arial" w:hAnsi="Arial"/>
-          <w:sz w:val="22"/>
-          <w:szCs w:val="22"/>
-        </w:rPr>
-        <w:t xml:space="preserve">Durante el desarrollo de esta evaluación, el equipo logró integrar conocimientos de prototipado ágil, modelos de calidad ISO9126/ISO25000 y control de versiones en un contexto real de modernización del sistema de Aduana chilena. La herramienta Figma permitió materializar los requisitos del caso en pantallas navegables, facilitando la validación de funcionalidades antes de una implementación real.</w:t>
-      </w:r>
-    </w:p>
-    <w:p>
-      <w:pPr>
-        <w:spacing w:after="60" w:before="60"/>
-      </w:pPr>
-      <w:r>
-        <w:t xml:space="preserve"/>
-      </w:r>
-    </w:p>
-    <w:p>
-      <w:pPr>
-        <w:pStyle w:val="Heading2"/>
-        <w:spacing w:after="120" w:before="240"/>
-      </w:pPr>
-      <w:r>
-        <w:rPr>
-          <w:rFonts w:ascii="Arial" w:cs="Arial" w:eastAsia="Arial" w:hAnsi="Arial"/>
-          <w:b/>
-          <w:bCs/>
-          <w:color w:val="1F5C99"/>
-          <w:sz w:val="24"/>
-          <w:szCs w:val="24"/>
-        </w:rPr>
-        <w:t xml:space="preserve">Principales desafíos enfrentados:</w:t>
-      </w:r>
-    </w:p>
-    <w:p>
-      <w:pPr>
-        <w:spacing w:after="60" w:before="60"/>
-        <w:ind w:left="720" w:hanging="360"/>
-      </w:pPr>
-      <w:r>
-        <w:rPr>
-          <w:rFonts w:ascii="Arial" w:cs="Arial" w:eastAsia="Arial" w:hAnsi="Arial"/>
-          <w:sz w:val="22"/>
-          <w:szCs w:val="22"/>
-        </w:rPr>
-        <w:t xml:space="preserve">• Cubrir todos los requisitos funcionales del caso (menores, vehículos, SAG, PDI, informes) en un prototipo coherente y navegable.</w:t>
-      </w:r>
-    </w:p>
-    <w:p>
-      <w:pPr>
-        <w:spacing w:after="60" w:before="60"/>
-        <w:ind w:left="720" w:hanging="360"/>
-      </w:pPr>
-      <w:r>
-        <w:rPr>
-          <w:rFonts w:ascii="Arial" w:cs="Arial" w:eastAsia="Arial" w:hAnsi="Arial"/>
-          <w:sz w:val="22"/>
-          <w:szCs w:val="22"/>
-        </w:rPr>
-        <w:t xml:space="preserve">• Seleccionar y aplicar correctamente las características de calidad ISO9126 más relevantes para un sistema de frontera de alta concurrencia.</w:t>
-      </w:r>
-    </w:p>
-    <w:p>
-      <w:pPr>
-        <w:spacing w:after="60" w:before="60"/>
-        <w:ind w:left="720" w:hanging="360"/>
-      </w:pPr>
-      <w:r>
-        <w:rPr>
-          <w:rFonts w:ascii="Arial" w:cs="Arial" w:eastAsia="Arial" w:hAnsi="Arial"/>
-          <w:sz w:val="22"/>
-          <w:szCs w:val="22"/>
-        </w:rPr>
-        <w:t xml:space="preserve">• Documentar el control de versiones de forma trazable, vinculando cada cambio al requisito que lo motivó.</w:t>
-      </w:r>
-    </w:p>
-    <w:p>
-      <w:pPr>
-        <w:spacing w:after="60" w:before="60"/>
-      </w:pPr>
-      <w:r>
-        <w:t xml:space="preserve"/>
-      </w:r>
-    </w:p>
-    <w:p>
-      <w:pPr>
-        <w:pStyle w:val="Heading2"/>
-        <w:spacing w:after="120" w:before="240"/>
-      </w:pPr>
-      <w:r>
-        <w:rPr>
-          <w:rFonts w:ascii="Arial" w:cs="Arial" w:eastAsia="Arial" w:hAnsi="Arial"/>
-          <w:b/>
-          <w:bCs/>
-          <w:color w:val="1F5C99"/>
-          <w:sz w:val="24"/>
-          <w:szCs w:val="24"/>
-        </w:rPr>
-        <w:t xml:space="preserve">Propuestas de mejora para futuras iteraciones:</w:t>
-      </w:r>
-    </w:p>
-    <w:p>
-      <w:pPr>
-        <w:spacing w:after="60" w:before="60"/>
-        <w:ind w:left="720" w:hanging="360"/>
-      </w:pPr>
-      <w:r>
-        <w:rPr>
-          <w:rFonts w:ascii="Arial" w:cs="Arial" w:eastAsia="Arial" w:hAnsi="Arial"/>
-          <w:sz w:val="22"/>
-          <w:szCs w:val="22"/>
-        </w:rPr>
-        <w:t xml:space="preserve">• Incorporar pruebas de usabilidad con funcionarios reales del servicio de Aduana para validar la interfaz.</w:t>
-      </w:r>
-    </w:p>
-    <w:p>
-      <w:pPr>
-        <w:spacing w:after="60" w:before="60"/>
-        <w:ind w:left="720" w:hanging="360"/>
-      </w:pPr>
-      <w:r>
-        <w:rPr>
-          <w:rFonts w:ascii="Arial" w:cs="Arial" w:eastAsia="Arial" w:hAnsi="Arial"/>
-          <w:sz w:val="22"/>
-          <w:szCs w:val="22"/>
-        </w:rPr>
-        <w:t xml:space="preserve">• Ampliar la integración con el sistema de migraciones argentino (Horcones) para simular el intercambio de datos limítrofe.</w:t>
-      </w:r>
-    </w:p>
-    <w:p>
-      <w:pPr>
-        <w:spacing w:after="60" w:before="60"/>
-        <w:ind w:left="720" w:hanging="360"/>
-      </w:pPr>
-      <w:r>
-        <w:rPr>
-          <w:rFonts w:ascii="Arial" w:cs="Arial" w:eastAsia="Arial" w:hAnsi="Arial"/>
-          <w:sz w:val="22"/>
-          <w:szCs w:val="22"/>
-        </w:rPr>
-        <w:t xml:space="preserve">• Agregar módulo de notificaciones en tiempo real sobre el estado del trámite para turistas y conductores en espera.</w:t>
-      </w:r>
-    </w:p>
-    <w:p>
-      <w:pPr>
-        <w:spacing w:after="60" w:before="60"/>
-      </w:pPr>
-      <w:r>
-        <w:t xml:space="preserve"/>
-      </w:r>
-    </w:p>
-    <w:p>
-      <w:pPr>
-        <w:pStyle w:val="Heading1"/>
-        <w:spacing w:after="160" w:before="320"/>
-      </w:pPr>
-      <w:r>
-        <w:rPr>
-          <w:rFonts w:ascii="Arial" w:cs="Arial" w:eastAsia="Arial" w:hAnsi="Arial"/>
-          <w:b/>
-          <w:bCs/>
-          <w:color w:val="003366"/>
-          <w:sz w:val="28"/>
-          <w:szCs w:val="28"/>
-        </w:rPr>
-        <w:t xml:space="preserve">8. Anexos</w:t>
+        <w:t xml:space="preserve">7. Anexos</w:t>
       </w:r>
     </w:p>
     <w:p>

</xml_diff>

<commit_message>
V1.4 - Agrega nombres integrantes: Felipe De Goyeneche y Maximiliano Masferrer
</commit_message>
<xml_diff>
--- a/informe/Informe_EP3_Aduana.docx
+++ b/informe/Informe_EP3_Aduana.docx
@@ -59,7 +59,7 @@
           <w:sz w:val="22"/>
           <w:szCs w:val="22"/>
         </w:rPr>
-        <w:t xml:space="preserve">Equipo: [Nombre del equipo / Integrantes]</w:t>
+        <w:t xml:space="preserve">Equipo: Felipe De Goyeneche — Maximiliano Masferrer</w:t>
       </w:r>
     </w:p>
     <w:p>
@@ -4808,7 +4808,7 @@
                 <w:sz w:val="20"/>
                 <w:szCs w:val="20"/>
               </w:rPr>
-              <w:t xml:space="preserve">Integrante 1</w:t>
+              <w:t xml:space="preserve">F. De Goyeneche</w:t>
             </w:r>
           </w:p>
         </w:tc>
@@ -4965,7 +4965,7 @@
                 <w:sz w:val="20"/>
                 <w:szCs w:val="20"/>
               </w:rPr>
-              <w:t xml:space="preserve">11-06-2026</w:t>
+              <w:t xml:space="preserve">10-06-2026</w:t>
             </w:r>
           </w:p>
         </w:tc>
@@ -4996,7 +4996,7 @@
                 <w:sz w:val="20"/>
                 <w:szCs w:val="20"/>
               </w:rPr>
-              <w:t xml:space="preserve">Integrante 2</w:t>
+              <w:t xml:space="preserve">M. Masferrer</w:t>
             </w:r>
           </w:p>
         </w:tc>
@@ -5153,7 +5153,7 @@
                 <w:sz w:val="20"/>
                 <w:szCs w:val="20"/>
               </w:rPr>
-              <w:t xml:space="preserve">12-06-2026</w:t>
+              <w:t xml:space="preserve">10-06-2026</w:t>
             </w:r>
           </w:p>
         </w:tc>
@@ -5184,7 +5184,7 @@
                 <w:sz w:val="20"/>
                 <w:szCs w:val="20"/>
               </w:rPr>
-              <w:t xml:space="preserve">Integrante 3</w:t>
+              <w:t xml:space="preserve">F. De Goyeneche</w:t>
             </w:r>
           </w:p>
         </w:tc>

</xml_diff>